<commit_message>
Added Least_privillege and RLS with a security definer function
Added a security mechanism to limit ai's capability on database to resolve prompt-injection vulnerabilities by applyin least_privilege, RLS with dependency injection and a safe security definer function
</commit_message>
<xml_diff>
--- a/corrections.DOCX
+++ b/corrections.DOCX
@@ -19,7 +19,25 @@
     </w:p>
     <w:p>
       <w:r>
-        <w:t>caching</w:t>
+        <w:t>C</w:t>
+      </w:r>
+      <w:r>
+        <w:t>aching</w:t>
+      </w:r>
+    </w:p>
+    <w:p>
+      <w:proofErr w:type="spellStart"/>
+      <w:r>
+        <w:t>Llm</w:t>
+      </w:r>
+      <w:proofErr w:type="spellEnd"/>
+      <w:r>
+        <w:t xml:space="preserve"> judge</w:t>
+      </w:r>
+    </w:p>
+    <w:p>
+      <w:r>
+        <w:t>User deletion if inactive or …banned</w:t>
       </w:r>
       <w:bookmarkStart w:id="0" w:name="_GoBack"/>
       <w:bookmarkEnd w:id="0"/>
@@ -703,7 +721,7 @@
   <a:extraClrSchemeLst/>
   <a:extLst>
     <a:ext uri="{05A4C25C-085E-4340-85A3-A5531E510DB2}">
-      <thm15:themeFamily xmlns:thm15="http://schemas.microsoft.com/office/thememl/2012/main" xmlns="" name="Office Theme" id="{62F939B6-93AF-4DB8-9C6B-D6C7DFDC589F}" vid="{4A3C46E8-61CC-4603-A589-7422A47A8E4A}"/>
+      <thm15:themeFamily xmlns="" xmlns:thm15="http://schemas.microsoft.com/office/thememl/2012/main" name="Office Theme" id="{62F939B6-93AF-4DB8-9C6B-D6C7DFDC589F}" vid="{4A3C46E8-61CC-4603-A589-7422A47A8E4A}"/>
     </a:ext>
   </a:extLst>
 </a:theme>

</xml_diff>